<commit_message>
INTIAL SQL CAPSTONE PROJECT
</commit_message>
<xml_diff>
--- a/SQL_Food_Delivery_Analytics_Report.docx
+++ b/SQL_Food_Delivery_Analytics_Report.docx
@@ -386,6 +386,12 @@
                 <w:rFonts w:ascii="Amasis MT Pro Black" w:hAnsi="Amasis MT Pro Black"/>
               </w:rPr>
             </w:pPr>
+            <w:r>
+              <w:rPr>
+                <w:rFonts w:ascii="Amasis MT Pro Black" w:hAnsi="Amasis MT Pro Black"/>
+              </w:rPr>
+              <w:t>3</w:t>
+            </w:r>
           </w:p>
         </w:tc>
       </w:tr>
@@ -449,6 +455,12 @@
                 <w:rFonts w:ascii="Amasis MT Pro Black" w:hAnsi="Amasis MT Pro Black"/>
               </w:rPr>
             </w:pPr>
+            <w:r>
+              <w:rPr>
+                <w:rFonts w:ascii="Amasis MT Pro Black" w:hAnsi="Amasis MT Pro Black"/>
+              </w:rPr>
+              <w:t>3</w:t>
+            </w:r>
           </w:p>
         </w:tc>
       </w:tr>
@@ -512,6 +524,12 @@
                 <w:rFonts w:ascii="Amasis MT Pro Black" w:hAnsi="Amasis MT Pro Black"/>
               </w:rPr>
             </w:pPr>
+            <w:r>
+              <w:rPr>
+                <w:rFonts w:ascii="Amasis MT Pro Black" w:hAnsi="Amasis MT Pro Black"/>
+              </w:rPr>
+              <w:t>4</w:t>
+            </w:r>
           </w:p>
         </w:tc>
       </w:tr>
@@ -579,6 +597,12 @@
                 <w:rFonts w:ascii="Amasis MT Pro Black" w:hAnsi="Amasis MT Pro Black"/>
               </w:rPr>
             </w:pPr>
+            <w:r>
+              <w:rPr>
+                <w:rFonts w:ascii="Amasis MT Pro Black" w:hAnsi="Amasis MT Pro Black"/>
+              </w:rPr>
+              <w:t>5</w:t>
+            </w:r>
           </w:p>
         </w:tc>
       </w:tr>
@@ -642,6 +666,12 @@
                 <w:rFonts w:ascii="Amasis MT Pro Black" w:hAnsi="Amasis MT Pro Black"/>
               </w:rPr>
             </w:pPr>
+            <w:r>
+              <w:rPr>
+                <w:rFonts w:ascii="Amasis MT Pro Black" w:hAnsi="Amasis MT Pro Black"/>
+              </w:rPr>
+              <w:t>6</w:t>
+            </w:r>
           </w:p>
         </w:tc>
       </w:tr>
@@ -709,6 +739,12 @@
                 <w:rFonts w:ascii="Amasis MT Pro Black" w:hAnsi="Amasis MT Pro Black"/>
               </w:rPr>
             </w:pPr>
+            <w:r>
+              <w:rPr>
+                <w:rFonts w:ascii="Amasis MT Pro Black" w:hAnsi="Amasis MT Pro Black"/>
+              </w:rPr>
+              <w:t>10</w:t>
+            </w:r>
           </w:p>
         </w:tc>
       </w:tr>
@@ -776,6 +812,12 @@
                 <w:rFonts w:ascii="Amasis MT Pro Black" w:hAnsi="Amasis MT Pro Black"/>
               </w:rPr>
             </w:pPr>
+            <w:r>
+              <w:rPr>
+                <w:rFonts w:ascii="Amasis MT Pro Black" w:hAnsi="Amasis MT Pro Black"/>
+              </w:rPr>
+              <w:t>13</w:t>
+            </w:r>
           </w:p>
         </w:tc>
       </w:tr>
@@ -843,6 +885,12 @@
                 <w:rFonts w:ascii="Amasis MT Pro Black" w:hAnsi="Amasis MT Pro Black"/>
               </w:rPr>
             </w:pPr>
+            <w:r>
+              <w:rPr>
+                <w:rFonts w:ascii="Amasis MT Pro Black" w:hAnsi="Amasis MT Pro Black"/>
+              </w:rPr>
+              <w:t>15</w:t>
+            </w:r>
           </w:p>
         </w:tc>
       </w:tr>
@@ -910,6 +958,12 @@
                 <w:rFonts w:ascii="Amasis MT Pro Black" w:hAnsi="Amasis MT Pro Black"/>
               </w:rPr>
             </w:pPr>
+            <w:r>
+              <w:rPr>
+                <w:rFonts w:ascii="Amasis MT Pro Black" w:hAnsi="Amasis MT Pro Black"/>
+              </w:rPr>
+              <w:t>17</w:t>
+            </w:r>
           </w:p>
         </w:tc>
       </w:tr>
@@ -977,6 +1031,12 @@
                 <w:rFonts w:ascii="Amasis MT Pro Black" w:hAnsi="Amasis MT Pro Black"/>
               </w:rPr>
             </w:pPr>
+            <w:r>
+              <w:rPr>
+                <w:rFonts w:ascii="Amasis MT Pro Black" w:hAnsi="Amasis MT Pro Black"/>
+              </w:rPr>
+              <w:t>19</w:t>
+            </w:r>
           </w:p>
         </w:tc>
       </w:tr>
@@ -1044,6 +1104,12 @@
                 <w:rFonts w:ascii="Amasis MT Pro Black" w:hAnsi="Amasis MT Pro Black"/>
               </w:rPr>
             </w:pPr>
+            <w:r>
+              <w:rPr>
+                <w:rFonts w:ascii="Amasis MT Pro Black" w:hAnsi="Amasis MT Pro Black"/>
+              </w:rPr>
+              <w:t>21</w:t>
+            </w:r>
           </w:p>
         </w:tc>
       </w:tr>
@@ -1111,6 +1177,12 @@
                 <w:rFonts w:ascii="Amasis MT Pro Black" w:hAnsi="Amasis MT Pro Black"/>
               </w:rPr>
             </w:pPr>
+            <w:r>
+              <w:rPr>
+                <w:rFonts w:ascii="Amasis MT Pro Black" w:hAnsi="Amasis MT Pro Black"/>
+              </w:rPr>
+              <w:t>22</w:t>
+            </w:r>
           </w:p>
         </w:tc>
       </w:tr>
@@ -1178,6 +1250,12 @@
                 <w:rFonts w:ascii="Amasis MT Pro Black" w:hAnsi="Amasis MT Pro Black"/>
               </w:rPr>
             </w:pPr>
+            <w:r>
+              <w:rPr>
+                <w:rFonts w:ascii="Amasis MT Pro Black" w:hAnsi="Amasis MT Pro Black"/>
+              </w:rPr>
+              <w:t>23</w:t>
+            </w:r>
           </w:p>
         </w:tc>
       </w:tr>
@@ -1245,6 +1323,12 @@
                 <w:rFonts w:ascii="Amasis MT Pro Black" w:hAnsi="Amasis MT Pro Black"/>
               </w:rPr>
             </w:pPr>
+            <w:r>
+              <w:rPr>
+                <w:rFonts w:ascii="Amasis MT Pro Black" w:hAnsi="Amasis MT Pro Black"/>
+              </w:rPr>
+              <w:t>24</w:t>
+            </w:r>
           </w:p>
         </w:tc>
       </w:tr>
@@ -1312,6 +1396,12 @@
                 <w:rFonts w:ascii="Amasis MT Pro Black" w:hAnsi="Amasis MT Pro Black"/>
               </w:rPr>
             </w:pPr>
+            <w:r>
+              <w:rPr>
+                <w:rFonts w:ascii="Amasis MT Pro Black" w:hAnsi="Amasis MT Pro Black"/>
+              </w:rPr>
+              <w:t>25</w:t>
+            </w:r>
           </w:p>
         </w:tc>
       </w:tr>
@@ -1379,6 +1469,12 @@
                 <w:rFonts w:ascii="Amasis MT Pro Black" w:hAnsi="Amasis MT Pro Black"/>
               </w:rPr>
             </w:pPr>
+            <w:r>
+              <w:rPr>
+                <w:rFonts w:ascii="Amasis MT Pro Black" w:hAnsi="Amasis MT Pro Black"/>
+              </w:rPr>
+              <w:t>26</w:t>
+            </w:r>
           </w:p>
         </w:tc>
       </w:tr>
@@ -1446,6 +1542,12 @@
                 <w:rFonts w:ascii="Amasis MT Pro Black" w:hAnsi="Amasis MT Pro Black"/>
               </w:rPr>
             </w:pPr>
+            <w:r>
+              <w:rPr>
+                <w:rFonts w:ascii="Amasis MT Pro Black" w:hAnsi="Amasis MT Pro Black"/>
+              </w:rPr>
+              <w:t>27</w:t>
+            </w:r>
           </w:p>
         </w:tc>
       </w:tr>
@@ -2367,23 +2469,7 @@
           <w:sz w:val="24"/>
           <w:szCs w:val="24"/>
         </w:rPr>
-        <w:t xml:space="preserve">Evaluate customer ordering </w:t>
-      </w:r>
-      <w:r>
-        <w:rPr>
-          <w:rFonts w:asciiTheme="majorBidi" w:hAnsiTheme="majorBidi" w:cstheme="majorBidi"/>
-          <w:sz w:val="24"/>
-          <w:szCs w:val="24"/>
-        </w:rPr>
-        <w:t>behaviour</w:t>
-      </w:r>
-      <w:r>
-        <w:rPr>
-          <w:rFonts w:asciiTheme="majorBidi" w:hAnsiTheme="majorBidi" w:cstheme="majorBidi"/>
-          <w:sz w:val="24"/>
-          <w:szCs w:val="24"/>
-        </w:rPr>
-        <w:t xml:space="preserve">, repeat purchase rates, and signup trends to identify factors that influence customer loyalty and retention. </w:t>
+        <w:t xml:space="preserve">Evaluate customer ordering behaviour, repeat purchase rates, and signup trends to identify factors that influence customer loyalty and retention. </w:t>
       </w:r>
     </w:p>
     <w:p>
@@ -2643,23 +2729,7 @@
           <w:sz w:val="24"/>
           <w:szCs w:val="24"/>
         </w:rPr>
-        <w:t xml:space="preserve">Analyze customer segments based on city, gender, and ordering </w:t>
-      </w:r>
-      <w:r>
-        <w:rPr>
-          <w:rFonts w:asciiTheme="majorBidi" w:hAnsiTheme="majorBidi" w:cstheme="majorBidi"/>
-          <w:sz w:val="24"/>
-          <w:szCs w:val="24"/>
-        </w:rPr>
-        <w:t>behaviour</w:t>
-      </w:r>
-      <w:r>
-        <w:rPr>
-          <w:rFonts w:asciiTheme="majorBidi" w:hAnsiTheme="majorBidi" w:cstheme="majorBidi"/>
-          <w:sz w:val="24"/>
-          <w:szCs w:val="24"/>
-        </w:rPr>
-        <w:t xml:space="preserve"> to support targeted marketing and personalized campaigns. </w:t>
+        <w:t xml:space="preserve">Analyze customer segments based on city, gender, and ordering behaviour to support targeted marketing and personalized campaigns. </w:t>
       </w:r>
     </w:p>
     <w:p>
@@ -3043,12 +3113,6 @@
         <w:gridCol w:w="7025"/>
       </w:tblGrid>
       <w:tr>
-        <w:tblPrEx>
-          <w:tblCellMar>
-            <w:top w:w="0" w:type="dxa"/>
-            <w:bottom w:w="0" w:type="dxa"/>
-          </w:tblCellMar>
-        </w:tblPrEx>
         <w:trPr>
           <w:trHeight w:val="292"/>
         </w:trPr>
@@ -3109,12 +3173,6 @@
         </w:tc>
       </w:tr>
       <w:tr>
-        <w:tblPrEx>
-          <w:tblCellMar>
-            <w:top w:w="0" w:type="dxa"/>
-            <w:bottom w:w="0" w:type="dxa"/>
-          </w:tblCellMar>
-        </w:tblPrEx>
         <w:trPr>
           <w:trHeight w:val="292"/>
         </w:trPr>
@@ -3203,12 +3261,6 @@
         </w:tc>
       </w:tr>
       <w:tr>
-        <w:tblPrEx>
-          <w:tblCellMar>
-            <w:top w:w="0" w:type="dxa"/>
-            <w:bottom w:w="0" w:type="dxa"/>
-          </w:tblCellMar>
-        </w:tblPrEx>
         <w:trPr>
           <w:trHeight w:val="305"/>
         </w:trPr>
@@ -3269,12 +3321,6 @@
         </w:tc>
       </w:tr>
       <w:tr>
-        <w:tblPrEx>
-          <w:tblCellMar>
-            <w:top w:w="0" w:type="dxa"/>
-            <w:bottom w:w="0" w:type="dxa"/>
-          </w:tblCellMar>
-        </w:tblPrEx>
         <w:trPr>
           <w:trHeight w:val="292"/>
         </w:trPr>
@@ -3335,12 +3381,6 @@
         </w:tc>
       </w:tr>
       <w:tr>
-        <w:tblPrEx>
-          <w:tblCellMar>
-            <w:top w:w="0" w:type="dxa"/>
-            <w:bottom w:w="0" w:type="dxa"/>
-          </w:tblCellMar>
-        </w:tblPrEx>
         <w:trPr>
           <w:trHeight w:val="292"/>
         </w:trPr>
@@ -3401,12 +3441,6 @@
         </w:tc>
       </w:tr>
       <w:tr>
-        <w:tblPrEx>
-          <w:tblCellMar>
-            <w:top w:w="0" w:type="dxa"/>
-            <w:bottom w:w="0" w:type="dxa"/>
-          </w:tblCellMar>
-        </w:tblPrEx>
         <w:trPr>
           <w:trHeight w:val="292"/>
         </w:trPr>
@@ -3697,23 +3731,7 @@
           <w:sz w:val="24"/>
           <w:szCs w:val="24"/>
         </w:rPr>
-        <w:t xml:space="preserve">This dataset enables comprehensive analysis of customer </w:t>
-      </w:r>
-      <w:r>
-        <w:rPr>
-          <w:rFonts w:ascii="Times New Roman" w:hAnsi="Times New Roman" w:cs="Times New Roman"/>
-          <w:sz w:val="24"/>
-          <w:szCs w:val="24"/>
-        </w:rPr>
-        <w:t>behaviour</w:t>
-      </w:r>
-      <w:r>
-        <w:rPr>
-          <w:rFonts w:ascii="Times New Roman" w:hAnsi="Times New Roman" w:cs="Times New Roman"/>
-          <w:sz w:val="24"/>
-          <w:szCs w:val="24"/>
-        </w:rPr>
-        <w:t>, restaurant performance, order trends, revenue generation, product popularity, payment preferences, and delivery efficiency. It serves as a strong foundation for applying SQL techniques such as joins, aggregations, subqueries, window functions, KPI reporting, and business intelligence analysis to solve real-world food delivery business problems.</w:t>
+        <w:t>This dataset enables comprehensive analysis of customer behaviour, restaurant performance, order trends, revenue generation, product popularity, payment preferences, and delivery efficiency. It serves as a strong foundation for applying SQL techniques such as joins, aggregations, subqueries, window functions, KPI reporting, and business intelligence analysis to solve real-world food delivery business problems.</w:t>
       </w:r>
     </w:p>
     <w:p>
@@ -3799,25 +3817,7 @@
           <w:sz w:val="24"/>
           <w:szCs w:val="24"/>
         </w:rPr>
-        <w:t xml:space="preserve">The Entity Relationship (ER) Diagram represents the logical structure of the Online Food Delivery database. It illustrates how different business entities such as customers, restaurants, orders, food items, and delivery agents interact with one another. The database follows a relational model where primary keys uniquely identify </w:t>
-      </w:r>
-      <w:r>
-        <w:rPr>
-          <w:rFonts w:ascii="Times New Roman" w:hAnsi="Times New Roman" w:cs="Times New Roman"/>
-          <w:color w:val="000000" w:themeColor="text1"/>
-          <w:sz w:val="24"/>
-          <w:szCs w:val="24"/>
-        </w:rPr>
-        <w:t>records,</w:t>
-      </w:r>
-      <w:r>
-        <w:rPr>
-          <w:rFonts w:ascii="Times New Roman" w:hAnsi="Times New Roman" w:cs="Times New Roman"/>
-          <w:color w:val="000000" w:themeColor="text1"/>
-          <w:sz w:val="24"/>
-          <w:szCs w:val="24"/>
-        </w:rPr>
-        <w:t xml:space="preserve"> and foreign keys establish relationships between tables.</w:t>
+        <w:t>The Entity Relationship (ER) Diagram represents the logical structure of the Online Food Delivery database. It illustrates how different business entities such as customers, restaurants, orders, food items, and delivery agents interact with one another. The database follows a relational model where primary keys uniquely identify records, and foreign keys establish relationships between tables.</w:t>
       </w:r>
     </w:p>
     <w:p>
@@ -5086,16 +5086,7 @@
           <w:szCs w:val="24"/>
         </w:rPr>
         <w:lastRenderedPageBreak/>
-        <w:t xml:space="preserve">4. </w:t>
-      </w:r>
-      <w:r>
-        <w:rPr>
-          <w:rFonts w:ascii="Times New Roman" w:hAnsi="Times New Roman" w:cs="Times New Roman"/>
-          <w:color w:val="000000" w:themeColor="text1"/>
-          <w:sz w:val="24"/>
-          <w:szCs w:val="24"/>
-        </w:rPr>
-        <w:t>Order Items</w:t>
+        <w:t>4. Order Items</w:t>
       </w:r>
     </w:p>
     <w:p>
@@ -5478,16 +5469,7 @@
           <w:sz w:val="24"/>
           <w:szCs w:val="24"/>
         </w:rPr>
-        <w:t xml:space="preserve">5. </w:t>
-      </w:r>
-      <w:r>
-        <w:rPr>
-          <w:rFonts w:ascii="Times New Roman" w:hAnsi="Times New Roman" w:cs="Times New Roman"/>
-          <w:color w:val="000000" w:themeColor="text1"/>
-          <w:sz w:val="24"/>
-          <w:szCs w:val="24"/>
-        </w:rPr>
-        <w:t>Delivery Agents</w:t>
+        <w:t>5. Delivery Agents</w:t>
       </w:r>
     </w:p>
     <w:p>
@@ -6195,29 +6177,7 @@
           <w:sz w:val="24"/>
           <w:szCs w:val="24"/>
         </w:rPr>
-        <w:t xml:space="preserve">One restaurant can </w:t>
-      </w:r>
-      <w:r>
-        <w:rPr>
-          <w:rFonts w:ascii="Times New Roman" w:hAnsi="Times New Roman" w:cs="Times New Roman"/>
-          <w:b w:val="0"/>
-          <w:bCs w:val="0"/>
-          <w:color w:val="000000" w:themeColor="text1"/>
-          <w:sz w:val="24"/>
-          <w:szCs w:val="24"/>
-        </w:rPr>
-        <w:t>fulfil</w:t>
-      </w:r>
-      <w:r>
-        <w:rPr>
-          <w:rFonts w:ascii="Times New Roman" w:hAnsi="Times New Roman" w:cs="Times New Roman"/>
-          <w:b w:val="0"/>
-          <w:bCs w:val="0"/>
-          <w:color w:val="000000" w:themeColor="text1"/>
-          <w:sz w:val="24"/>
-          <w:szCs w:val="24"/>
-        </w:rPr>
-        <w:t xml:space="preserve"> many orders.</w:t>
+        <w:t>One restaurant can fulfil many orders.</w:t>
       </w:r>
     </w:p>
     <w:p>
@@ -6361,18 +6321,7 @@
           <w:sz w:val="24"/>
           <w:szCs w:val="24"/>
         </w:rPr>
-        <w:t xml:space="preserve">Orders → </w:t>
-      </w:r>
-      <w:r>
-        <w:rPr>
-          <w:rFonts w:ascii="Times New Roman" w:hAnsi="Times New Roman" w:cs="Times New Roman"/>
-          <w:b w:val="0"/>
-          <w:bCs w:val="0"/>
-          <w:color w:val="000000" w:themeColor="text1"/>
-          <w:sz w:val="24"/>
-          <w:szCs w:val="24"/>
-        </w:rPr>
-        <w:t>Order Items</w:t>
+        <w:t>Orders → Order Items</w:t>
       </w:r>
     </w:p>
     <w:p>
@@ -6771,18 +6720,7 @@
                 <w:sz w:val="24"/>
                 <w:szCs w:val="24"/>
               </w:rPr>
-              <w:t>1:</w:t>
-            </w:r>
-            <w:r>
-              <w:rPr>
-                <w:rFonts w:ascii="Times New Roman" w:hAnsi="Times New Roman" w:cs="Times New Roman"/>
-                <w:b w:val="0"/>
-                <w:bCs w:val="0"/>
-                <w:color w:val="000000" w:themeColor="text1"/>
-                <w:sz w:val="24"/>
-                <w:szCs w:val="24"/>
-              </w:rPr>
-              <w:t xml:space="preserve"> Many</w:t>
+              <w:t>1: Many</w:t>
             </w:r>
           </w:p>
         </w:tc>
@@ -6850,18 +6788,7 @@
                 <w:sz w:val="24"/>
                 <w:szCs w:val="24"/>
               </w:rPr>
-              <w:t>1:</w:t>
-            </w:r>
-            <w:r>
-              <w:rPr>
-                <w:rFonts w:ascii="Times New Roman" w:hAnsi="Times New Roman" w:cs="Times New Roman"/>
-                <w:b w:val="0"/>
-                <w:bCs w:val="0"/>
-                <w:color w:val="000000" w:themeColor="text1"/>
-                <w:sz w:val="24"/>
-                <w:szCs w:val="24"/>
-              </w:rPr>
-              <w:t xml:space="preserve"> Many</w:t>
+              <w:t>1: Many</w:t>
             </w:r>
           </w:p>
         </w:tc>
@@ -6898,18 +6825,7 @@
                 <w:sz w:val="24"/>
                 <w:szCs w:val="24"/>
               </w:rPr>
-              <w:t xml:space="preserve">Orders → </w:t>
-            </w:r>
-            <w:r>
-              <w:rPr>
-                <w:rFonts w:ascii="Times New Roman" w:hAnsi="Times New Roman" w:cs="Times New Roman"/>
-                <w:b w:val="0"/>
-                <w:bCs w:val="0"/>
-                <w:color w:val="000000" w:themeColor="text1"/>
-                <w:sz w:val="24"/>
-                <w:szCs w:val="24"/>
-              </w:rPr>
-              <w:t>Order Items</w:t>
+              <w:t>Orders → Order Items</w:t>
             </w:r>
           </w:p>
         </w:tc>
@@ -6940,18 +6856,7 @@
                 <w:sz w:val="24"/>
                 <w:szCs w:val="24"/>
               </w:rPr>
-              <w:t>1:</w:t>
-            </w:r>
-            <w:r>
-              <w:rPr>
-                <w:rFonts w:ascii="Times New Roman" w:hAnsi="Times New Roman" w:cs="Times New Roman"/>
-                <w:b w:val="0"/>
-                <w:bCs w:val="0"/>
-                <w:color w:val="000000" w:themeColor="text1"/>
-                <w:sz w:val="24"/>
-                <w:szCs w:val="24"/>
-              </w:rPr>
-              <w:t xml:space="preserve"> Many</w:t>
+              <w:t>1: Many</w:t>
             </w:r>
           </w:p>
         </w:tc>
@@ -9532,7 +9437,6 @@
         </w:rPr>
         <w:t xml:space="preserve">FROM orders </w:t>
       </w:r>
-      <w:proofErr w:type="spellStart"/>
       <w:r>
         <w:rPr>
           <w:rFonts w:ascii="Courier New" w:eastAsia="Courier New" w:hAnsi="Courier New" w:cs="Courier New"/>
@@ -9542,7 +9446,6 @@
         </w:rPr>
         <w:t>o</w:t>
       </w:r>
-      <w:proofErr w:type="spellEnd"/>
       <w:r>
         <w:rPr>
           <w:rFonts w:ascii="Courier New" w:eastAsia="Courier New" w:hAnsi="Courier New" w:cs="Courier New"/>
@@ -9742,39 +9645,43 @@
           <w:sz w:val="20"/>
           <w:szCs w:val="20"/>
         </w:rPr>
-        <w:t>r. restaurant</w:t>
-      </w:r>
-      <w:r>
+        <w:t>r. restaurant_id,</w:t>
+      </w:r>
+    </w:p>
+    <w:p>
+      <w:pPr>
+        <w:shd w:val="clear" w:color="auto" w:fill="F2F2F2"/>
+        <w:spacing w:before="40" w:after="40"/>
+        <w:ind w:left="360"/>
         <w:rPr>
           <w:rFonts w:ascii="Courier New" w:eastAsia="Courier New" w:hAnsi="Courier New" w:cs="Courier New"/>
           <w:color w:val="1A1A1A"/>
           <w:sz w:val="20"/>
           <w:szCs w:val="20"/>
         </w:rPr>
-        <w:t>_id,</w:t>
-      </w:r>
-    </w:p>
-    <w:p>
-      <w:pPr>
-        <w:shd w:val="clear" w:color="auto" w:fill="F2F2F2"/>
-        <w:spacing w:before="40" w:after="40"/>
-        <w:ind w:left="360"/>
+      </w:pPr>
+      <w:r>
         <w:rPr>
           <w:rFonts w:ascii="Courier New" w:eastAsia="Courier New" w:hAnsi="Courier New" w:cs="Courier New"/>
           <w:color w:val="1A1A1A"/>
           <w:sz w:val="20"/>
           <w:szCs w:val="20"/>
         </w:rPr>
-      </w:pPr>
-      <w:r>
+        <w:t>    r. restaurant_name,</w:t>
+      </w:r>
+    </w:p>
+    <w:p>
+      <w:pPr>
+        <w:shd w:val="clear" w:color="auto" w:fill="F2F2F2"/>
+        <w:spacing w:before="40" w:after="40"/>
+        <w:ind w:left="360"/>
         <w:rPr>
           <w:rFonts w:ascii="Courier New" w:eastAsia="Courier New" w:hAnsi="Courier New" w:cs="Courier New"/>
           <w:color w:val="1A1A1A"/>
           <w:sz w:val="20"/>
           <w:szCs w:val="20"/>
         </w:rPr>
-        <w:t xml:space="preserve">    </w:t>
-      </w:r>
+      </w:pPr>
       <w:r>
         <w:rPr>
           <w:rFonts w:ascii="Courier New" w:eastAsia="Courier New" w:hAnsi="Courier New" w:cs="Courier New"/>
@@ -9782,39 +9689,43 @@
           <w:sz w:val="20"/>
           <w:szCs w:val="20"/>
         </w:rPr>
-        <w:t>r. restaurant</w:t>
-      </w:r>
-      <w:r>
+        <w:t>    r. Rating AS avg_rating,</w:t>
+      </w:r>
+    </w:p>
+    <w:p>
+      <w:pPr>
+        <w:shd w:val="clear" w:color="auto" w:fill="F2F2F2"/>
+        <w:spacing w:before="40" w:after="40"/>
+        <w:ind w:left="360"/>
         <w:rPr>
           <w:rFonts w:ascii="Courier New" w:eastAsia="Courier New" w:hAnsi="Courier New" w:cs="Courier New"/>
           <w:color w:val="1A1A1A"/>
           <w:sz w:val="20"/>
           <w:szCs w:val="20"/>
         </w:rPr>
-        <w:t>_name,</w:t>
-      </w:r>
-    </w:p>
-    <w:p>
-      <w:pPr>
-        <w:shd w:val="clear" w:color="auto" w:fill="F2F2F2"/>
-        <w:spacing w:before="40" w:after="40"/>
-        <w:ind w:left="360"/>
+      </w:pPr>
+      <w:r>
         <w:rPr>
           <w:rFonts w:ascii="Courier New" w:eastAsia="Courier New" w:hAnsi="Courier New" w:cs="Courier New"/>
           <w:color w:val="1A1A1A"/>
           <w:sz w:val="20"/>
           <w:szCs w:val="20"/>
         </w:rPr>
-      </w:pPr>
-      <w:r>
+        <w:t>    SUM(o.order_amount - o.discount) AS total_revenue</w:t>
+      </w:r>
+    </w:p>
+    <w:p>
+      <w:pPr>
+        <w:shd w:val="clear" w:color="auto" w:fill="F2F2F2"/>
+        <w:spacing w:before="40" w:after="40"/>
+        <w:ind w:left="360"/>
         <w:rPr>
           <w:rFonts w:ascii="Courier New" w:eastAsia="Courier New" w:hAnsi="Courier New" w:cs="Courier New"/>
           <w:color w:val="1A1A1A"/>
           <w:sz w:val="20"/>
           <w:szCs w:val="20"/>
         </w:rPr>
-        <w:t xml:space="preserve">    </w:t>
-      </w:r>
+      </w:pPr>
       <w:r>
         <w:rPr>
           <w:rFonts w:ascii="Courier New" w:eastAsia="Courier New" w:hAnsi="Courier New" w:cs="Courier New"/>
@@ -9822,140 +9733,51 @@
           <w:sz w:val="20"/>
           <w:szCs w:val="20"/>
         </w:rPr>
-        <w:t>r. Rating</w:t>
-      </w:r>
-      <w:r>
+        <w:t>FROM restaurants r</w:t>
+      </w:r>
+    </w:p>
+    <w:p>
+      <w:pPr>
+        <w:shd w:val="clear" w:color="auto" w:fill="F2F2F2"/>
+        <w:spacing w:before="40" w:after="40"/>
+        <w:ind w:left="360"/>
         <w:rPr>
           <w:rFonts w:ascii="Courier New" w:eastAsia="Courier New" w:hAnsi="Courier New" w:cs="Courier New"/>
           <w:color w:val="1A1A1A"/>
           <w:sz w:val="20"/>
           <w:szCs w:val="20"/>
         </w:rPr>
-        <w:t xml:space="preserve"> AS avg_rating,</w:t>
-      </w:r>
-    </w:p>
-    <w:p>
-      <w:pPr>
-        <w:shd w:val="clear" w:color="auto" w:fill="F2F2F2"/>
-        <w:spacing w:before="40" w:after="40"/>
-        <w:ind w:left="360"/>
+      </w:pPr>
+      <w:r>
         <w:rPr>
           <w:rFonts w:ascii="Courier New" w:eastAsia="Courier New" w:hAnsi="Courier New" w:cs="Courier New"/>
           <w:color w:val="1A1A1A"/>
           <w:sz w:val="20"/>
           <w:szCs w:val="20"/>
         </w:rPr>
-      </w:pPr>
-      <w:r>
+        <w:t>JOIN orders o</w:t>
+      </w:r>
+    </w:p>
+    <w:p>
+      <w:pPr>
+        <w:shd w:val="clear" w:color="auto" w:fill="F2F2F2"/>
+        <w:spacing w:before="40" w:after="40"/>
+        <w:ind w:left="360"/>
         <w:rPr>
           <w:rFonts w:ascii="Courier New" w:eastAsia="Courier New" w:hAnsi="Courier New" w:cs="Courier New"/>
           <w:color w:val="1A1A1A"/>
           <w:sz w:val="20"/>
           <w:szCs w:val="20"/>
         </w:rPr>
-        <w:t>    SUM(o.order_amount - o.discount) AS total_revenue</w:t>
-      </w:r>
-    </w:p>
-    <w:p>
-      <w:pPr>
-        <w:shd w:val="clear" w:color="auto" w:fill="F2F2F2"/>
-        <w:spacing w:before="40" w:after="40"/>
-        <w:ind w:left="360"/>
+      </w:pPr>
+      <w:r>
         <w:rPr>
           <w:rFonts w:ascii="Courier New" w:eastAsia="Courier New" w:hAnsi="Courier New" w:cs="Courier New"/>
           <w:color w:val="1A1A1A"/>
           <w:sz w:val="20"/>
           <w:szCs w:val="20"/>
         </w:rPr>
-      </w:pPr>
-      <w:r>
-        <w:rPr>
-          <w:rFonts w:ascii="Courier New" w:eastAsia="Courier New" w:hAnsi="Courier New" w:cs="Courier New"/>
-          <w:color w:val="1A1A1A"/>
-          <w:sz w:val="20"/>
-          <w:szCs w:val="20"/>
-        </w:rPr>
-        <w:t>FROM restaurants r</w:t>
-      </w:r>
-    </w:p>
-    <w:p>
-      <w:pPr>
-        <w:shd w:val="clear" w:color="auto" w:fill="F2F2F2"/>
-        <w:spacing w:before="40" w:after="40"/>
-        <w:ind w:left="360"/>
-        <w:rPr>
-          <w:rFonts w:ascii="Courier New" w:eastAsia="Courier New" w:hAnsi="Courier New" w:cs="Courier New"/>
-          <w:color w:val="1A1A1A"/>
-          <w:sz w:val="20"/>
-          <w:szCs w:val="20"/>
-        </w:rPr>
-      </w:pPr>
-      <w:r>
-        <w:rPr>
-          <w:rFonts w:ascii="Courier New" w:eastAsia="Courier New" w:hAnsi="Courier New" w:cs="Courier New"/>
-          <w:color w:val="1A1A1A"/>
-          <w:sz w:val="20"/>
-          <w:szCs w:val="20"/>
-        </w:rPr>
-        <w:t>JOIN orders o</w:t>
-      </w:r>
-    </w:p>
-    <w:p>
-      <w:pPr>
-        <w:shd w:val="clear" w:color="auto" w:fill="F2F2F2"/>
-        <w:spacing w:before="40" w:after="40"/>
-        <w:ind w:left="360"/>
-        <w:rPr>
-          <w:rFonts w:ascii="Courier New" w:eastAsia="Courier New" w:hAnsi="Courier New" w:cs="Courier New"/>
-          <w:color w:val="1A1A1A"/>
-          <w:sz w:val="20"/>
-          <w:szCs w:val="20"/>
-        </w:rPr>
-      </w:pPr>
-      <w:r>
-        <w:rPr>
-          <w:rFonts w:ascii="Courier New" w:eastAsia="Courier New" w:hAnsi="Courier New" w:cs="Courier New"/>
-          <w:color w:val="1A1A1A"/>
-          <w:sz w:val="20"/>
-          <w:szCs w:val="20"/>
-        </w:rPr>
-        <w:t xml:space="preserve">    ON </w:t>
-      </w:r>
-      <w:r>
-        <w:rPr>
-          <w:rFonts w:ascii="Courier New" w:eastAsia="Courier New" w:hAnsi="Courier New" w:cs="Courier New"/>
-          <w:color w:val="1A1A1A"/>
-          <w:sz w:val="20"/>
-          <w:szCs w:val="20"/>
-        </w:rPr>
-        <w:t>r. restaurant</w:t>
-      </w:r>
-      <w:r>
-        <w:rPr>
-          <w:rFonts w:ascii="Courier New" w:eastAsia="Courier New" w:hAnsi="Courier New" w:cs="Courier New"/>
-          <w:color w:val="1A1A1A"/>
-          <w:sz w:val="20"/>
-          <w:szCs w:val="20"/>
-        </w:rPr>
-        <w:t xml:space="preserve">_id = </w:t>
-      </w:r>
-      <w:r>
-        <w:rPr>
-          <w:rFonts w:ascii="Courier New" w:eastAsia="Courier New" w:hAnsi="Courier New" w:cs="Courier New"/>
-          <w:color w:val="1A1A1A"/>
-          <w:sz w:val="20"/>
-          <w:szCs w:val="20"/>
-        </w:rPr>
-        <w:t>o. restaurant</w:t>
-      </w:r>
-      <w:r>
-        <w:rPr>
-          <w:rFonts w:ascii="Courier New" w:eastAsia="Courier New" w:hAnsi="Courier New" w:cs="Courier New"/>
-          <w:color w:val="1A1A1A"/>
-          <w:sz w:val="20"/>
-          <w:szCs w:val="20"/>
-        </w:rPr>
-        <w:t>_id</w:t>
+        <w:t>    ON r. restaurant_id = o. restaurant_id</w:t>
       </w:r>
     </w:p>
     <w:p>
@@ -10196,27 +10018,7 @@
           <w:sz w:val="20"/>
           <w:szCs w:val="20"/>
         </w:rPr>
-        <w:t xml:space="preserve">FROM orders </w:t>
-      </w:r>
-      <w:proofErr w:type="spellStart"/>
-      <w:r>
-        <w:rPr>
-          <w:rFonts w:ascii="Courier New" w:eastAsia="Courier New" w:hAnsi="Courier New" w:cs="Courier New"/>
-          <w:color w:val="1A1A1A"/>
-          <w:sz w:val="20"/>
-          <w:szCs w:val="20"/>
-        </w:rPr>
-        <w:t>o</w:t>
-      </w:r>
-      <w:proofErr w:type="spellEnd"/>
-      <w:r>
-        <w:rPr>
-          <w:rFonts w:ascii="Courier New" w:eastAsia="Courier New" w:hAnsi="Courier New" w:cs="Courier New"/>
-          <w:color w:val="1A1A1A"/>
-          <w:sz w:val="20"/>
-          <w:szCs w:val="20"/>
-        </w:rPr>
-        <w:t xml:space="preserve"> JOIN restaurants r ON </w:t>
+        <w:t xml:space="preserve">FROM orders o JOIN restaurants r ON </w:t>
       </w:r>
       <w:r>
         <w:rPr>
@@ -11370,17 +11172,21 @@
           <w:sz w:val="20"/>
           <w:szCs w:val="20"/>
         </w:rPr>
-        <w:t xml:space="preserve">    SELECT </w:t>
-      </w:r>
-      <w:r>
+        <w:t xml:space="preserve">    SELECT r. restaurant_name, SUM (o. order_amount) AS total_revenue FROM restaurants r</w:t>
+      </w:r>
+    </w:p>
+    <w:p>
+      <w:pPr>
+        <w:shd w:val="clear" w:color="auto" w:fill="F2F2F2"/>
+        <w:spacing w:before="40" w:after="40"/>
+        <w:ind w:left="360"/>
         <w:rPr>
           <w:rFonts w:ascii="Courier New" w:eastAsia="Courier New" w:hAnsi="Courier New" w:cs="Courier New"/>
           <w:color w:val="1A1A1A"/>
           <w:sz w:val="20"/>
           <w:szCs w:val="20"/>
         </w:rPr>
-        <w:t>r. restaurant</w:t>
-      </w:r>
+      </w:pPr>
       <w:r>
         <w:rPr>
           <w:rFonts w:ascii="Courier New" w:eastAsia="Courier New" w:hAnsi="Courier New" w:cs="Courier New"/>
@@ -11388,17 +11194,21 @@
           <w:sz w:val="20"/>
           <w:szCs w:val="20"/>
         </w:rPr>
-        <w:t xml:space="preserve">_name, </w:t>
-      </w:r>
-      <w:r>
+        <w:t xml:space="preserve">    JOIN orders o ON r. restaurant_id = o. restaurant_id GROUP BY r. restaurant_name</w:t>
+      </w:r>
+    </w:p>
+    <w:p>
+      <w:pPr>
+        <w:shd w:val="clear" w:color="auto" w:fill="F2F2F2"/>
+        <w:spacing w:before="40" w:after="40"/>
+        <w:ind w:left="360"/>
         <w:rPr>
           <w:rFonts w:ascii="Courier New" w:eastAsia="Courier New" w:hAnsi="Courier New" w:cs="Courier New"/>
           <w:color w:val="1A1A1A"/>
           <w:sz w:val="20"/>
           <w:szCs w:val="20"/>
         </w:rPr>
-        <w:t>SUM (o. order</w:t>
-      </w:r>
+      </w:pPr>
       <w:r>
         <w:rPr>
           <w:rFonts w:ascii="Courier New" w:eastAsia="Courier New" w:hAnsi="Courier New" w:cs="Courier New"/>
@@ -11406,123 +11216,7 @@
           <w:sz w:val="20"/>
           <w:szCs w:val="20"/>
         </w:rPr>
-        <w:t>_amount) AS total_revenue FROM restaurants r</w:t>
-      </w:r>
-    </w:p>
-    <w:p>
-      <w:pPr>
-        <w:shd w:val="clear" w:color="auto" w:fill="F2F2F2"/>
-        <w:spacing w:before="40" w:after="40"/>
-        <w:ind w:left="360"/>
-        <w:rPr>
-          <w:rFonts w:ascii="Courier New" w:eastAsia="Courier New" w:hAnsi="Courier New" w:cs="Courier New"/>
-          <w:color w:val="1A1A1A"/>
-          <w:sz w:val="20"/>
-          <w:szCs w:val="20"/>
-        </w:rPr>
-      </w:pPr>
-      <w:r>
-        <w:rPr>
-          <w:rFonts w:ascii="Courier New" w:eastAsia="Courier New" w:hAnsi="Courier New" w:cs="Courier New"/>
-          <w:color w:val="1A1A1A"/>
-          <w:sz w:val="20"/>
-          <w:szCs w:val="20"/>
-        </w:rPr>
-        <w:t xml:space="preserve">    JOIN orders o ON </w:t>
-      </w:r>
-      <w:r>
-        <w:rPr>
-          <w:rFonts w:ascii="Courier New" w:eastAsia="Courier New" w:hAnsi="Courier New" w:cs="Courier New"/>
-          <w:color w:val="1A1A1A"/>
-          <w:sz w:val="20"/>
-          <w:szCs w:val="20"/>
-        </w:rPr>
-        <w:t>r. restaurant</w:t>
-      </w:r>
-      <w:r>
-        <w:rPr>
-          <w:rFonts w:ascii="Courier New" w:eastAsia="Courier New" w:hAnsi="Courier New" w:cs="Courier New"/>
-          <w:color w:val="1A1A1A"/>
-          <w:sz w:val="20"/>
-          <w:szCs w:val="20"/>
-        </w:rPr>
-        <w:t xml:space="preserve">_id = </w:t>
-      </w:r>
-      <w:r>
-        <w:rPr>
-          <w:rFonts w:ascii="Courier New" w:eastAsia="Courier New" w:hAnsi="Courier New" w:cs="Courier New"/>
-          <w:color w:val="1A1A1A"/>
-          <w:sz w:val="20"/>
-          <w:szCs w:val="20"/>
-        </w:rPr>
-        <w:t>o. restaurant</w:t>
-      </w:r>
-      <w:r>
-        <w:rPr>
-          <w:rFonts w:ascii="Courier New" w:eastAsia="Courier New" w:hAnsi="Courier New" w:cs="Courier New"/>
-          <w:color w:val="1A1A1A"/>
-          <w:sz w:val="20"/>
-          <w:szCs w:val="20"/>
-        </w:rPr>
-        <w:t xml:space="preserve">_id GROUP BY </w:t>
-      </w:r>
-      <w:r>
-        <w:rPr>
-          <w:rFonts w:ascii="Courier New" w:eastAsia="Courier New" w:hAnsi="Courier New" w:cs="Courier New"/>
-          <w:color w:val="1A1A1A"/>
-          <w:sz w:val="20"/>
-          <w:szCs w:val="20"/>
-        </w:rPr>
-        <w:t>r. restaurant</w:t>
-      </w:r>
-      <w:r>
-        <w:rPr>
-          <w:rFonts w:ascii="Courier New" w:eastAsia="Courier New" w:hAnsi="Courier New" w:cs="Courier New"/>
-          <w:color w:val="1A1A1A"/>
-          <w:sz w:val="20"/>
-          <w:szCs w:val="20"/>
-        </w:rPr>
-        <w:t>_name</w:t>
-      </w:r>
-    </w:p>
-    <w:p>
-      <w:pPr>
-        <w:shd w:val="clear" w:color="auto" w:fill="F2F2F2"/>
-        <w:spacing w:before="40" w:after="40"/>
-        <w:ind w:left="360"/>
-        <w:rPr>
-          <w:rFonts w:ascii="Courier New" w:eastAsia="Courier New" w:hAnsi="Courier New" w:cs="Courier New"/>
-          <w:color w:val="1A1A1A"/>
-          <w:sz w:val="20"/>
-          <w:szCs w:val="20"/>
-        </w:rPr>
-      </w:pPr>
-      <w:r>
-        <w:rPr>
-          <w:rFonts w:ascii="Courier New" w:eastAsia="Courier New" w:hAnsi="Courier New" w:cs="Courier New"/>
-          <w:color w:val="1A1A1A"/>
-          <w:sz w:val="20"/>
-          <w:szCs w:val="20"/>
-        </w:rPr>
-        <w:t xml:space="preserve">) AS r_rev WHERE total_revenue &gt; (SELECT AVG(t_rev) FROM (SELECT </w:t>
-      </w:r>
-      <w:r>
-        <w:rPr>
-          <w:rFonts w:ascii="Courier New" w:eastAsia="Courier New" w:hAnsi="Courier New" w:cs="Courier New"/>
-          <w:color w:val="1A1A1A"/>
-          <w:sz w:val="20"/>
-          <w:szCs w:val="20"/>
-        </w:rPr>
-        <w:t>SUM (</w:t>
-      </w:r>
-      <w:r>
-        <w:rPr>
-          <w:rFonts w:ascii="Courier New" w:eastAsia="Courier New" w:hAnsi="Courier New" w:cs="Courier New"/>
-          <w:color w:val="1A1A1A"/>
-          <w:sz w:val="20"/>
-          <w:szCs w:val="20"/>
-        </w:rPr>
-        <w:t>order_amount) AS t_rev FROM orders GROUP BY restaurant_id) AS a_rev) ORDER BY total_revenue DESC;</w:t>
+        <w:t>) AS r_rev WHERE total_revenue &gt; (SELECT AVG(t_rev) FROM (SELECT SUM (order_amount) AS t_rev FROM orders GROUP BY restaurant_id) AS a_rev) ORDER BY total_revenue DESC;</w:t>
       </w:r>
     </w:p>
     <w:p>
@@ -11797,27 +11491,7 @@
           <w:sz w:val="20"/>
           <w:szCs w:val="20"/>
         </w:rPr>
-        <w:t xml:space="preserve">FROM orders </w:t>
-      </w:r>
-      <w:proofErr w:type="spellStart"/>
-      <w:r>
-        <w:rPr>
-          <w:rFonts w:ascii="Courier New" w:eastAsia="Courier New" w:hAnsi="Courier New" w:cs="Courier New"/>
-          <w:color w:val="1A1A1A"/>
-          <w:sz w:val="20"/>
-          <w:szCs w:val="20"/>
-        </w:rPr>
-        <w:t>o</w:t>
-      </w:r>
-      <w:proofErr w:type="spellEnd"/>
-      <w:r>
-        <w:rPr>
-          <w:rFonts w:ascii="Courier New" w:eastAsia="Courier New" w:hAnsi="Courier New" w:cs="Courier New"/>
-          <w:color w:val="1A1A1A"/>
-          <w:sz w:val="20"/>
-          <w:szCs w:val="20"/>
-        </w:rPr>
-        <w:t xml:space="preserve"> JOIN restaurants r ON </w:t>
+        <w:t xml:space="preserve">FROM orders o JOIN restaurants r ON </w:t>
       </w:r>
       <w:r>
         <w:rPr>
@@ -12345,13 +12019,7 @@
         <w:spacing w:before="60" w:after="80"/>
       </w:pPr>
       <w:r>
-        <w:t xml:space="preserve">Business </w:t>
-      </w:r>
-      <w:r>
-        <w:t>Insight: Indexes</w:t>
-      </w:r>
-      <w:r>
-        <w:t xml:space="preserve"> on frequently filtered or joined columns drastically reduce query execution time. By indexing order_date, customer name, and restaurant name, the database engine avoids full table scans on the orders and lookup tables, improving performance significantly at scale.</w:t>
+        <w:t>Business Insight: Indexes on frequently filtered or joined columns drastically reduce query execution time. By indexing order_date, customer name, and restaurant name, the database engine avoids full table scans on the orders and lookup tables, improving performance significantly at scale.</w:t>
       </w:r>
     </w:p>
     <w:p>
@@ -12918,29 +12586,7 @@
           <w:sz w:val="24"/>
           <w:szCs w:val="24"/>
         </w:rPr>
-        <w:t xml:space="preserve">The SQL analysis was performed on the Online Food Delivery database to evaluate business performance across revenue generation, customer </w:t>
-      </w:r>
-      <w:r>
-        <w:rPr>
-          <w:rFonts w:asciiTheme="majorBidi" w:hAnsiTheme="majorBidi" w:cstheme="majorBidi"/>
-          <w:b w:val="0"/>
-          <w:bCs w:val="0"/>
-          <w:color w:val="000000" w:themeColor="text1"/>
-          <w:sz w:val="24"/>
-          <w:szCs w:val="24"/>
-        </w:rPr>
-        <w:t>behaviour</w:t>
-      </w:r>
-      <w:r>
-        <w:rPr>
-          <w:rFonts w:asciiTheme="majorBidi" w:hAnsiTheme="majorBidi" w:cstheme="majorBidi"/>
-          <w:b w:val="0"/>
-          <w:bCs w:val="0"/>
-          <w:color w:val="000000" w:themeColor="text1"/>
-          <w:sz w:val="24"/>
-          <w:szCs w:val="24"/>
-        </w:rPr>
-        <w:t>, restaurant effectiveness, product demand, and operational efficiency. The findings provide actionable insights that can support management in making data-driven decisions to improve profitability and customer experience.</w:t>
+        <w:t>The SQL analysis was performed on the Online Food Delivery database to evaluate business performance across revenue generation, customer behaviour, restaurant effectiveness, product demand, and operational efficiency. The findings provide actionable insights that can support management in making data-driven decisions to improve profitability and customer experience.</w:t>
       </w:r>
     </w:p>
     <w:p>
@@ -14810,31 +14456,7 @@
           <w:sz w:val="24"/>
           <w:szCs w:val="24"/>
         </w:rPr>
-        <w:t xml:space="preserve">Customers increasingly </w:t>
-      </w:r>
-      <w:proofErr w:type="spellStart"/>
-      <w:r>
-        <w:rPr>
-          <w:rFonts w:asciiTheme="majorBidi" w:hAnsiTheme="majorBidi" w:cstheme="majorBidi"/>
-          <w:b w:val="0"/>
-          <w:bCs w:val="0"/>
-          <w:color w:val="000000" w:themeColor="text1"/>
-          <w:sz w:val="24"/>
-          <w:szCs w:val="24"/>
-        </w:rPr>
-        <w:t>favor</w:t>
-      </w:r>
-      <w:proofErr w:type="spellEnd"/>
-      <w:r>
-        <w:rPr>
-          <w:rFonts w:asciiTheme="majorBidi" w:hAnsiTheme="majorBidi" w:cstheme="majorBidi"/>
-          <w:b w:val="0"/>
-          <w:bCs w:val="0"/>
-          <w:color w:val="000000" w:themeColor="text1"/>
-          <w:sz w:val="24"/>
-          <w:szCs w:val="24"/>
-        </w:rPr>
-        <w:t xml:space="preserve"> cashless transactions.</w:t>
+        <w:t>Customers increasingly favor cashless transactions.</w:t>
       </w:r>
     </w:p>
     <w:p>
@@ -15218,31 +14840,7 @@
           <w:sz w:val="24"/>
           <w:szCs w:val="24"/>
         </w:rPr>
-        <w:t xml:space="preserve">Delivery efficiency impacts repeat order </w:t>
-      </w:r>
-      <w:proofErr w:type="spellStart"/>
-      <w:r>
-        <w:rPr>
-          <w:rFonts w:asciiTheme="majorBidi" w:hAnsiTheme="majorBidi" w:cstheme="majorBidi"/>
-          <w:b w:val="0"/>
-          <w:bCs w:val="0"/>
-          <w:color w:val="000000" w:themeColor="text1"/>
-          <w:sz w:val="24"/>
-          <w:szCs w:val="24"/>
-        </w:rPr>
-        <w:t>behavior</w:t>
-      </w:r>
-      <w:proofErr w:type="spellEnd"/>
-      <w:r>
-        <w:rPr>
-          <w:rFonts w:asciiTheme="majorBidi" w:hAnsiTheme="majorBidi" w:cstheme="majorBidi"/>
-          <w:b w:val="0"/>
-          <w:bCs w:val="0"/>
-          <w:color w:val="000000" w:themeColor="text1"/>
-          <w:sz w:val="24"/>
-          <w:szCs w:val="24"/>
-        </w:rPr>
-        <w:t>.</w:t>
+        <w:t>Delivery efficiency impacts repeat order behavior.</w:t>
       </w:r>
     </w:p>
     <w:p>
@@ -16076,7 +15674,7 @@
           <w:sz w:val="24"/>
           <w:szCs w:val="24"/>
         </w:rPr>
-        <w:t xml:space="preserve">Improved filtering performance in </w:t>
+        <w:t>Improved filtering performance in W</w:t>
       </w:r>
       <w:r>
         <w:rPr>
@@ -16085,7 +15683,7 @@
           <w:sz w:val="24"/>
           <w:szCs w:val="24"/>
         </w:rPr>
-        <w:t>W</w:t>
+        <w:t>H</w:t>
       </w:r>
       <w:r>
         <w:rPr>
@@ -16094,25 +15692,7 @@
           <w:sz w:val="24"/>
           <w:szCs w:val="24"/>
         </w:rPr>
-        <w:t>H</w:t>
-      </w:r>
-      <w:r>
-        <w:rPr>
-          <w:rFonts w:asciiTheme="majorBidi" w:hAnsiTheme="majorBidi" w:cstheme="majorBidi"/>
-          <w:color w:val="404040"/>
-          <w:sz w:val="24"/>
-          <w:szCs w:val="24"/>
-        </w:rPr>
-        <w:t>ERE</w:t>
-      </w:r>
-      <w:r>
-        <w:rPr>
-          <w:rFonts w:asciiTheme="majorBidi" w:hAnsiTheme="majorBidi" w:cstheme="majorBidi"/>
-          <w:color w:val="404040"/>
-          <w:sz w:val="24"/>
-          <w:szCs w:val="24"/>
-        </w:rPr>
-        <w:t xml:space="preserve"> clauses.</w:t>
+        <w:t>ERE clauses.</w:t>
       </w:r>
     </w:p>
     <w:p>
@@ -17189,15 +16769,7 @@
           <w:szCs w:val="28"/>
         </w:rPr>
         <w:lastRenderedPageBreak/>
-        <w:t xml:space="preserve">Temporary </w:t>
-      </w:r>
-      <w:r>
-        <w:rPr>
-          <w:color w:val="2E75B6"/>
-          <w:sz w:val="28"/>
-          <w:szCs w:val="28"/>
-        </w:rPr>
-        <w:t>Tables</w:t>
+        <w:t>Temporary Tables</w:t>
       </w:r>
       <w:r>
         <w:rPr>
@@ -21352,51 +20924,7 @@
           <w:sz w:val="28"/>
           <w:szCs w:val="28"/>
         </w:rPr>
-        <w:t xml:space="preserve">This project successfully demonstrated how SQL can be utilized to transform raw transactional data into meaningful business intelligence for an Online Food Delivery platform. By </w:t>
-      </w:r>
-      <w:r>
-        <w:rPr>
-          <w:rFonts w:asciiTheme="majorBidi" w:hAnsiTheme="majorBidi" w:cstheme="majorBidi"/>
-          <w:b w:val="0"/>
-          <w:bCs w:val="0"/>
-          <w:color w:val="000000" w:themeColor="text1"/>
-          <w:sz w:val="28"/>
-          <w:szCs w:val="28"/>
-        </w:rPr>
-        <w:t>analysing</w:t>
-      </w:r>
-      <w:r>
-        <w:rPr>
-          <w:rFonts w:asciiTheme="majorBidi" w:hAnsiTheme="majorBidi" w:cstheme="majorBidi"/>
-          <w:b w:val="0"/>
-          <w:bCs w:val="0"/>
-          <w:color w:val="000000" w:themeColor="text1"/>
-          <w:sz w:val="28"/>
-          <w:szCs w:val="28"/>
-        </w:rPr>
-        <w:t xml:space="preserve"> customer </w:t>
-      </w:r>
-      <w:r>
-        <w:rPr>
-          <w:rFonts w:asciiTheme="majorBidi" w:hAnsiTheme="majorBidi" w:cstheme="majorBidi"/>
-          <w:b w:val="0"/>
-          <w:bCs w:val="0"/>
-          <w:color w:val="000000" w:themeColor="text1"/>
-          <w:sz w:val="28"/>
-          <w:szCs w:val="28"/>
-        </w:rPr>
-        <w:t>behaviour</w:t>
-      </w:r>
-      <w:r>
-        <w:rPr>
-          <w:rFonts w:asciiTheme="majorBidi" w:hAnsiTheme="majorBidi" w:cstheme="majorBidi"/>
-          <w:b w:val="0"/>
-          <w:bCs w:val="0"/>
-          <w:color w:val="000000" w:themeColor="text1"/>
-          <w:sz w:val="28"/>
-          <w:szCs w:val="28"/>
-        </w:rPr>
-        <w:t>, restaurant performance, revenue trends, product demand, payment preferences, and delivery operations, valuable insights were generated to support data-driven decision-making. The project highlighted key opportunities for improving revenue growth, customer retention, operational efficiency, and overall business performance. Additionally, the implementation of relational database concepts, joins, aggregations, subqueries, CTEs, and performance optimization techniques strengthened the analytical capabilities of the system. Overall, this project showcases the practical application of SQL in solving real-world business problems and delivering actionable insights that can help food delivery companies achieve sustainable growth and competitive advantage.</w:t>
+        <w:t>This project successfully demonstrated how SQL can be utilized to transform raw transactional data into meaningful business intelligence for an Online Food Delivery platform. By analysing customer behaviour, restaurant performance, revenue trends, product demand, payment preferences, and delivery operations, valuable insights were generated to support data-driven decision-making. The project highlighted key opportunities for improving revenue growth, customer retention, operational efficiency, and overall business performance. Additionally, the implementation of relational database concepts, joins, aggregations, subqueries, CTEs, and performance optimization techniques strengthened the analytical capabilities of the system. Overall, this project showcases the practical application of SQL in solving real-world business problems and delivering actionable insights that can help food delivery companies achieve sustainable growth and competitive advantage.</w:t>
       </w:r>
     </w:p>
     <w:p>
@@ -21440,13 +20968,7 @@
       </w:pPr>
       <w:r>
         <w:lastRenderedPageBreak/>
-        <w:t>1</w:t>
-      </w:r>
-      <w:r>
-        <w:t>2</w:t>
-      </w:r>
-      <w:r>
-        <w:t>. Future Scope</w:t>
+        <w:t>12. Future Scope</w:t>
       </w:r>
     </w:p>
     <w:p>
@@ -21475,29 +20997,7 @@
           <w:sz w:val="24"/>
           <w:szCs w:val="24"/>
         </w:rPr>
-        <w:t xml:space="preserve">The Online Food Delivery Business Intelligence &amp; Performance Analysis project provides a strong analytical foundation for understanding customer </w:t>
-      </w:r>
-      <w:r>
-        <w:rPr>
-          <w:rFonts w:asciiTheme="majorBidi" w:hAnsiTheme="majorBidi" w:cstheme="majorBidi"/>
-          <w:b w:val="0"/>
-          <w:bCs w:val="0"/>
-          <w:color w:val="000000" w:themeColor="text1"/>
-          <w:sz w:val="24"/>
-          <w:szCs w:val="24"/>
-        </w:rPr>
-        <w:t>behaviour</w:t>
-      </w:r>
-      <w:r>
-        <w:rPr>
-          <w:rFonts w:asciiTheme="majorBidi" w:hAnsiTheme="majorBidi" w:cstheme="majorBidi"/>
-          <w:b w:val="0"/>
-          <w:bCs w:val="0"/>
-          <w:color w:val="000000" w:themeColor="text1"/>
-          <w:sz w:val="24"/>
-          <w:szCs w:val="24"/>
-        </w:rPr>
-        <w:t>, revenue performance, restaurant effectiveness, and operational efficiency. While the current implementation focuses on SQL-based analytics and reporting, there are several opportunities to expand the system into a more advanced, automated, and intelligent decision-support platform.</w:t>
+        <w:t>The Online Food Delivery Business Intelligence &amp; Performance Analysis project provides a strong analytical foundation for understanding customer behaviour, revenue performance, restaurant effectiveness, and operational efficiency. While the current implementation focuses on SQL-based analytics and reporting, there are several opportunities to expand the system into a more advanced, automated, and intelligent decision-support platform.</w:t>
       </w:r>
     </w:p>
     <w:p>
@@ -21613,29 +21113,7 @@
           <w:sz w:val="24"/>
           <w:szCs w:val="24"/>
         </w:rPr>
-        <w:t xml:space="preserve">The project can further evolve through advanced analytical </w:t>
-      </w:r>
-      <w:r>
-        <w:rPr>
-          <w:rFonts w:asciiTheme="majorBidi" w:hAnsiTheme="majorBidi" w:cstheme="majorBidi"/>
-          <w:b w:val="0"/>
-          <w:bCs w:val="0"/>
-          <w:color w:val="000000" w:themeColor="text1"/>
-          <w:sz w:val="24"/>
-          <w:szCs w:val="24"/>
-        </w:rPr>
-        <w:t>modelling</w:t>
-      </w:r>
-      <w:r>
-        <w:rPr>
-          <w:rFonts w:asciiTheme="majorBidi" w:hAnsiTheme="majorBidi" w:cstheme="majorBidi"/>
-          <w:b w:val="0"/>
-          <w:bCs w:val="0"/>
-          <w:color w:val="000000" w:themeColor="text1"/>
-          <w:sz w:val="24"/>
-          <w:szCs w:val="24"/>
-        </w:rPr>
-        <w:t>. Historical order data can be leveraged to perform demand forecasting, seasonal trend analysis, customer segmentation, and revenue prediction. Such predictive analytics would help businesses optimize inventory planning, staffing requirements, marketing campaigns, and restaurant partnerships based on future demand patterns.</w:t>
+        <w:t>The project can further evolve through advanced analytical modelling. Historical order data can be leveraged to perform demand forecasting, seasonal trend analysis, customer segmentation, and revenue prediction. Such predictive analytics would help businesses optimize inventory planning, staffing requirements, marketing campaigns, and restaurant partnerships based on future demand patterns.</w:t>
       </w:r>
     </w:p>
     <w:p>
@@ -21664,29 +21142,7 @@
           <w:sz w:val="24"/>
           <w:szCs w:val="24"/>
         </w:rPr>
-        <w:t xml:space="preserve">A major future opportunity lies in the integration of Machine Learning and Artificial Intelligence. Machine learning models can be developed to predict customer churn, forecast sales, recommend personalized food items, estimate delivery times, and detect unusual transaction patterns. AI-powered recommendation systems can improve customer engagement by suggesting restaurants and menu items based on user preferences and past ordering </w:t>
-      </w:r>
-      <w:r>
-        <w:rPr>
-          <w:rFonts w:asciiTheme="majorBidi" w:hAnsiTheme="majorBidi" w:cstheme="majorBidi"/>
-          <w:b w:val="0"/>
-          <w:bCs w:val="0"/>
-          <w:color w:val="000000" w:themeColor="text1"/>
-          <w:sz w:val="24"/>
-          <w:szCs w:val="24"/>
-        </w:rPr>
-        <w:t>behaviour</w:t>
-      </w:r>
-      <w:r>
-        <w:rPr>
-          <w:rFonts w:asciiTheme="majorBidi" w:hAnsiTheme="majorBidi" w:cstheme="majorBidi"/>
-          <w:b w:val="0"/>
-          <w:bCs w:val="0"/>
-          <w:color w:val="000000" w:themeColor="text1"/>
-          <w:sz w:val="24"/>
-          <w:szCs w:val="24"/>
-        </w:rPr>
-        <w:t>.</w:t>
+        <w:t>A major future opportunity lies in the integration of Machine Learning and Artificial Intelligence. Machine learning models can be developed to predict customer churn, forecast sales, recommend personalized food items, estimate delivery times, and detect unusual transaction patterns. AI-powered recommendation systems can improve customer engagement by suggesting restaurants and menu items based on user preferences and past ordering behaviour.</w:t>
       </w:r>
     </w:p>
     <w:p>
@@ -32170,6 +31626,7 @@
   <w:style w:type="character" w:default="1" w:styleId="DefaultParagraphFont">
     <w:name w:val="Default Paragraph Font"/>
     <w:uiPriority w:val="1"/>
+    <w:semiHidden/>
     <w:unhideWhenUsed/>
   </w:style>
   <w:style w:type="table" w:default="1" w:styleId="TableNormal">

</xml_diff>